<commit_message>
feat: add timeline-aligned explainer video generation
</commit_message>
<xml_diff>
--- a/to_be_submitted_docs/开发说明书.docx
+++ b/to_be_submitted_docs/开发说明书.docx
@@ -206,7 +206,7 @@
                 <w:color w:val="111827"/>
                 <w:sz w:val="19"/>
               </w:rPr>
-              <w:t>V2.0（重点重构版）</w:t>
+              <w:t>V2.1（多模态讲解视频版）</w:t>
             </w:r>
           </w:p>
         </w:tc>
@@ -316,7 +316,7 @@
                 <w:color w:val="111827"/>
                 <w:sz w:val="21"/>
               </w:rPr>
-              <w:t>项目的核心创新不是叠加一个通用聊天框，而是把学习画像、课程结构、来源搜集、多模态生成、练习、路径、辅导、评估和安全校验拆成 9 个可观测角色，在同一学习记录中形成可追溯、可反馈、可持续更新的闭环。</w:t>
+              <w:t>项目的核心创新是由 9 个职责清晰、过程可观测的智能体共同维护学习闭环，并将文本、结构化题库、图谱、代码、图片、播客和讲解视频统一纳入来源约束的生成体系。学习画像、课程资料、练习反馈和路径调整在同一学习记录中持续积累，学生可以核验来源、观察过程并修正画像。</w:t>
             </w:r>
           </w:p>
         </w:tc>
@@ -353,7 +353,7 @@
         <w:rPr>
           <w:rFonts w:ascii="Calibri" w:hAnsi="Calibri" w:eastAsia="Microsoft YaHei"/>
         </w:rPr>
-        <w:t>本说明书以当前仓库代码和 2026 年 7 月 19 日实测结果为依据。重点展开 4 项创新：画像即来源（Profile-as-Source）、9 角色模式路由、来源约束的多模态资产流水线、长任务可观测与防幻觉阻断。</w:t>
+        <w:t>本说明书以当前仓库代码和 2026 年 7 月 19 日实测结果为依据。重点展开 5 项创新：画像即来源（Profile-as-Source）、9 角色模式路由、来源约束的多模态资产流水线、基于真实语音时间轴的讲解视频生成，以及长任务可观测与防幻觉阻断。</w:t>
       </w:r>
     </w:p>
     <w:p>
@@ -681,7 +681,7 @@
                 <w:color w:val="111827"/>
                 <w:sz w:val="17"/>
               </w:rPr>
-              <w:t>7 类直接编排资产 + 独立播客音频管线</w:t>
+              <w:t>7 类 Studio 资产 + 播客音频 + 讲解视频</w:t>
             </w:r>
           </w:p>
         </w:tc>
@@ -706,7 +706,7 @@
                 <w:color w:val="111827"/>
                 <w:sz w:val="17"/>
               </w:rPr>
-              <w:t>requested_outputs；PodcastService</w:t>
+              <w:t>requested_outputs；PodcastService；FFmpeg</w:t>
             </w:r>
           </w:p>
         </w:tc>
@@ -1470,7 +1470,7 @@
                 <w:color w:val="111827"/>
                 <w:sz w:val="21"/>
               </w:rPr>
-              <w:t>一个围绕课程资料运行的主动学习系统，而不是无边界的通用 AI 助手。</w:t>
+              <w:t>面向高校课程自主学习的主动学习系统，以学生确认的课程资料为事实边界，连接画像、资源、练习、路径和反馈。</w:t>
             </w:r>
           </w:p>
         </w:tc>
@@ -1523,7 +1523,7 @@
         <w:rPr>
           <w:rFonts w:ascii="Calibri" w:hAnsi="Calibri" w:eastAsia="Microsoft YaHei"/>
         </w:rPr>
-        <w:t>行动侧：讲解、测验、闪卡、思维导图、拓展阅读、代码实验、图片与播客。</w:t>
+        <w:t>行动侧：讲解、测验、闪卡、思维导图、拓展阅读、代码实验、图片、播客与讲解视频。</w:t>
       </w:r>
     </w:p>
     <w:p>
@@ -1562,7 +1562,7 @@
         <w:rPr>
           <w:rFonts w:ascii="Calibri" w:hAnsi="Calibri" w:eastAsia="Microsoft YaHei"/>
         </w:rPr>
-        <w:t>传统系统把画像放在一次性表单或孤立用户表中。ForgeNote 将“学习画像”保存为学习记录内可查看、可编辑、可检索的特殊 Source。画像与课程资料共享 notebook 上下文，既能参与个性化，也允许学生主动修正模型假设。</w:t>
+        <w:t>ForgeNote 将“学习画像”保存为学习记录内可查看、可编辑、可检索的特殊 Source。画像与课程资料共享 notebook 上下文，能够参与内容个性化；学生也可以直接查看证据和置信度，修正不准确的模型判断。</w:t>
       </w:r>
     </w:p>
     <w:tbl>
@@ -2179,7 +2179,7 @@
         <w:rPr>
           <w:rFonts w:ascii="Calibri" w:hAnsi="Calibri" w:eastAsia="Microsoft YaHei"/>
         </w:rPr>
-        <w:t>多智能体不是简单把同一个模型调用九次，而是先定义角色职责与输出契约，再按交互模式激活必要角色。chat 只启用画像、辅导、评估和安全；collect 启用画像、课程、搜集和安全；generate 执行完整链路。</w:t>
+        <w:t>9 个智能体分别拥有独立职责、输入输出契约和阶段状态，并由交互模式决定实际参与者。chat 启用画像、辅导、评估和安全角色；collect 启用画像、课程、搜集和安全角色；generate 执行完整学习链路。</w:t>
       </w:r>
     </w:p>
     <w:tbl>
@@ -2256,7 +2256,7 @@
         <w:rPr>
           <w:rFonts w:ascii="Calibri" w:hAnsi="Calibri" w:eastAsia="Microsoft YaHei"/>
         </w:rPr>
-        <w:t>学生先选择可信来源，再选择需要的资产类型。文本资产使用学习资产模型生成结构化 JSON；图片资产进入独立图片模型；播客由脚本、说话人配置、TTS 与音频合成管线完成。测验、闪卡、思维导图和 Markdown 在保存前执行结构修复与完整性校验。</w:t>
+        <w:t>学生先选择可信来源，再选择需要的资产类型。文本资产使用学习资产模型生成结构化 JSON；图片资产进入独立图片模型；播客和讲解视频共享脚本、说话人配置与 TTS 管线。测验、闪卡、思维导图和 Markdown 在保存前执行结构修复与完整性校验。</w:t>
       </w:r>
     </w:p>
     <w:p>
@@ -2264,7 +2264,7 @@
         <w:pStyle w:val="Heading2"/>
       </w:pPr>
       <w:r>
-        <w:t>2.4 创新四：可观测长任务与防幻觉阻断</w:t>
+        <w:t>2.4 创新四：真实语音时间轴驱动的讲解视频</w:t>
       </w:r>
     </w:p>
     <w:p>
@@ -2272,7 +2272,23 @@
         <w:rPr>
           <w:rFonts w:ascii="Calibri" w:hAnsi="Calibri" w:eastAsia="Microsoft YaHei"/>
         </w:rPr>
-        <w:t>系统同时提供轻量 SSE 阶段流和可持久化 command job。更关键的是，当用户选择了来源但来源正文尚未解析完成时，生成流程返回空资产并提示等待，而不是使用模型常识补写。这是一条可以自动测试的硬约束。</w:t>
+        <w:t>脚本模型在返回逐句播客内容时，同时为概念切换点给出 visual_prompt。TTS 完成后，系统读取每句台词的真实起始时间，将视觉提示转换为带 time_index 的关键帧计划，再调用图片模型生成 16:9 画面。最后由本地 FFmpeg 按时间轴把图片和播客音频合成为 H.264/AAC MP4。视频画面与讲解内容来自同一份脚本，时间对齐可以复现，也不需要视频生成 API。</w:t>
+      </w:r>
+    </w:p>
+    <w:p>
+      <w:pPr>
+        <w:pStyle w:val="Heading2"/>
+      </w:pPr>
+      <w:r>
+        <w:t>2.5 创新五：可观测长任务与防幻觉阻断</w:t>
+      </w:r>
+    </w:p>
+    <w:p>
+      <w:r>
+        <w:rPr>
+          <w:rFonts w:ascii="Calibri" w:hAnsi="Calibri" w:eastAsia="Microsoft YaHei"/>
+        </w:rPr>
+        <w:t>系统同时提供轻量 SSE 阶段流和可持久化 command job。用户选择的来源尚未完成正文解析时，生成流程返回空资产并提示等待，从执行层阻止无依据内容进入学习资产；该行为由专项验收用例持续验证。</w:t>
       </w:r>
     </w:p>
     <w:p>
@@ -4068,6 +4084,84 @@
           </w:p>
         </w:tc>
       </w:tr>
+      <w:tr>
+        <w:tc>
+          <w:tcPr>
+            <w:tcW w:type="dxa" w:w="1800"/>
+            <w:tcMar>
+              <w:top w:w="80" w:type="dxa"/>
+              <w:bottom w:w="80" w:type="dxa"/>
+              <w:start w:w="120" w:type="dxa"/>
+              <w:end w:w="120" w:type="dxa"/>
+            </w:tcMar>
+            <w:vAlign w:val="center"/>
+          </w:tcPr>
+          <w:p>
+            <w:pPr>
+              <w:spacing w:after="0" w:line="276" w:lineRule="auto"/>
+              <w:jc w:val="center"/>
+            </w:pPr>
+            <w:r>
+              <w:rPr>
+                <w:rFonts w:ascii="Calibri" w:hAnsi="Calibri" w:eastAsia="Microsoft YaHei"/>
+                <w:color w:val="111827"/>
+                <w:sz w:val="17"/>
+              </w:rPr>
+              <w:t>讲解视频</w:t>
+            </w:r>
+          </w:p>
+        </w:tc>
+        <w:tc>
+          <w:tcPr>
+            <w:tcW w:type="dxa" w:w="4200"/>
+            <w:tcMar>
+              <w:top w:w="80" w:type="dxa"/>
+              <w:bottom w:w="80" w:type="dxa"/>
+              <w:start w:w="120" w:type="dxa"/>
+              <w:end w:w="120" w:type="dxa"/>
+            </w:tcMar>
+            <w:vAlign w:val="center"/>
+          </w:tcPr>
+          <w:p>
+            <w:pPr>
+              <w:spacing w:after="0" w:line="276" w:lineRule="auto"/>
+            </w:pPr>
+            <w:r>
+              <w:rPr>
+                <w:rFonts w:ascii="Calibri" w:hAnsi="Calibri" w:eastAsia="Microsoft YaHei"/>
+                <w:color w:val="111827"/>
+                <w:sz w:val="17"/>
+              </w:rPr>
+              <w:t>脚本视觉提示 → 真实 TTS 时间轴 → 图片 → 本地 MP4</w:t>
+            </w:r>
+          </w:p>
+        </w:tc>
+        <w:tc>
+          <w:tcPr>
+            <w:tcW w:type="dxa" w:w="3360"/>
+            <w:tcMar>
+              <w:top w:w="80" w:type="dxa"/>
+              <w:bottom w:w="80" w:type="dxa"/>
+              <w:start w:w="120" w:type="dxa"/>
+              <w:end w:w="120" w:type="dxa"/>
+            </w:tcMar>
+            <w:vAlign w:val="center"/>
+          </w:tcPr>
+          <w:p>
+            <w:pPr>
+              <w:spacing w:after="0" w:line="276" w:lineRule="auto"/>
+            </w:pPr>
+            <w:r>
+              <w:rPr>
+                <w:rFonts w:ascii="Calibri" w:hAnsi="Calibri" w:eastAsia="Microsoft YaHei"/>
+                <w:color w:val="111827"/>
+                <w:sz w:val="17"/>
+              </w:rPr>
+              <w:t>图文同步讲解与低成本复习</w:t>
+            </w:r>
+          </w:p>
+        </w:tc>
+      </w:tr>
     </w:tbl>
     <w:p>
       <w:pPr>
@@ -4079,7 +4173,7 @@
         <w:pStyle w:val="Heading2"/>
       </w:pPr>
       <w:r>
-        <w:t>4.2 生成质量控制</w:t>
+        <w:t>4.2 讲解视频生成流程</w:t>
       </w:r>
     </w:p>
     <w:p>
@@ -4094,7 +4188,7 @@
         <w:rPr>
           <w:rFonts w:ascii="Calibri" w:hAnsi="Calibri" w:eastAsia="Microsoft YaHei"/>
         </w:rPr>
-        <w:t>只返回学生明确选择的资产，避免一次生成过多低价值内容。</w:t>
+        <w:t>脚本模型返回 speaker、dialogue 和可选 visual_prompt；每个分段设置 1–3 个有学习价值的关键画面。</w:t>
       </w:r>
     </w:p>
     <w:p>
@@ -4109,7 +4203,7 @@
         <w:rPr>
           <w:rFonts w:ascii="Calibri" w:hAnsi="Calibri" w:eastAsia="Microsoft YaHei"/>
         </w:rPr>
-        <w:t>学习画像用于调整解释方式，但画像 Source 会从事实证据上下文中剔除，避免把画像元数据生成成课程知识。</w:t>
+        <w:t>TTS 逐句生成语音并写入真实 start_time；关键帧计划以该时间为准，合并相邻提示并限制最多 12 帧。</w:t>
       </w:r>
     </w:p>
     <w:p>
@@ -4124,7 +4218,7 @@
         <w:rPr>
           <w:rFonts w:ascii="Calibri" w:hAnsi="Calibri" w:eastAsia="Microsoft YaHei"/>
         </w:rPr>
-        <w:t>闪卡有效数量不足 6 张或缺少证据字段时判定生成无效；Quiz 统一校验答案索引与解析。</w:t>
+        <w:t>图片模型按 16:9 教学画面提示生成图片；每帧保存时间点、台词序号、提示词、模型和供应商信息。</w:t>
       </w:r>
     </w:p>
     <w:p>
@@ -4139,7 +4233,7 @@
         <w:rPr>
           <w:rFonts w:ascii="Calibri" w:hAnsi="Calibri" w:eastAsia="Microsoft YaHei"/>
         </w:rPr>
-        <w:t>Mind map 修复未闭合代码围栏；Markdown 修复破损表格和块边界。</w:t>
+        <w:t>FFmpeg 依据相邻 time_index 计算每张图片的持续时长，与播客音频合成为 1280×720 H.264/AAC MP4。</w:t>
       </w:r>
     </w:p>
     <w:p>
@@ -4154,7 +4248,153 @@
         <w:rPr>
           <w:rFonts w:ascii="Calibri" w:hAnsi="Calibri" w:eastAsia="Microsoft YaHei"/>
         </w:rPr>
-        <w:t>图片模型凭据缺失时给出配置错误，不生成伪图片；播客模型与 TTS 模型按用途隔离。</w:t>
+        <w:t>视频为用户显式勾选的可选输出；图片或合成失败时保留已经完成的播客音频，并返回独立 video_error。</w:t>
+      </w:r>
+    </w:p>
+    <w:p>
+      <w:pPr>
+        <w:spacing w:after="0"/>
+        <w:jc w:val="center"/>
+      </w:pPr>
+      <w:r>
+        <w:drawing>
+          <wp:inline xmlns:a="http://schemas.openxmlformats.org/drawingml/2006/main" xmlns:pic="http://schemas.openxmlformats.org/drawingml/2006/picture">
+            <wp:extent cx="5897880" cy="3317557"/>
+            <wp:docPr id="2" name="Picture 2"/>
+            <wp:cNvGraphicFramePr>
+              <a:graphicFrameLocks noChangeAspect="1"/>
+            </wp:cNvGraphicFramePr>
+            <a:graphic>
+              <a:graphicData uri="http://schemas.openxmlformats.org/drawingml/2006/picture">
+                <pic:pic>
+                  <pic:nvPicPr>
+                    <pic:cNvPr id="0" name="screenshot-explainer-video-dialog.png"/>
+                    <pic:cNvPicPr/>
+                  </pic:nvPicPr>
+                  <pic:blipFill>
+                    <a:blip r:embed="rId12"/>
+                    <a:stretch>
+                      <a:fillRect/>
+                    </a:stretch>
+                  </pic:blipFill>
+                  <pic:spPr>
+                    <a:xfrm>
+                      <a:off x="0" y="0"/>
+                      <a:ext cx="5897880" cy="3317557"/>
+                    </a:xfrm>
+                    <a:prstGeom prst="rect"/>
+                  </pic:spPr>
+                </pic:pic>
+              </a:graphicData>
+            </a:graphic>
+          </wp:inline>
+        </w:drawing>
+      </w:r>
+    </w:p>
+    <w:p>
+      <w:pPr>
+        <w:pStyle w:val="Caption"/>
+      </w:pPr>
+      <w:r>
+        <w:t>图 2 高清界面：讲解视频为播客生成任务的可选输出，无需配置视频模型</w:t>
+      </w:r>
+    </w:p>
+    <w:p>
+      <w:pPr>
+        <w:pStyle w:val="Heading2"/>
+      </w:pPr>
+      <w:r>
+        <w:t>4.3 生成质量控制</w:t>
+      </w:r>
+    </w:p>
+    <w:p>
+      <w:pPr>
+        <w:spacing w:after="80" w:line="300" w:lineRule="auto"/>
+        <w:numPr>
+          <w:ilvl w:val="0"/>
+          <w:numId w:val="15"/>
+        </w:numPr>
+      </w:pPr>
+      <w:r>
+        <w:rPr>
+          <w:rFonts w:ascii="Calibri" w:hAnsi="Calibri" w:eastAsia="Microsoft YaHei"/>
+        </w:rPr>
+        <w:t>只返回学生明确选择的资产，避免一次生成过多低价值内容。</w:t>
+      </w:r>
+    </w:p>
+    <w:p>
+      <w:pPr>
+        <w:spacing w:after="80" w:line="300" w:lineRule="auto"/>
+        <w:numPr>
+          <w:ilvl w:val="0"/>
+          <w:numId w:val="15"/>
+        </w:numPr>
+      </w:pPr>
+      <w:r>
+        <w:rPr>
+          <w:rFonts w:ascii="Calibri" w:hAnsi="Calibri" w:eastAsia="Microsoft YaHei"/>
+        </w:rPr>
+        <w:t>学习画像用于调整解释方式，但画像 Source 会从事实证据上下文中剔除，避免把画像元数据生成成课程知识。</w:t>
+      </w:r>
+    </w:p>
+    <w:p>
+      <w:pPr>
+        <w:spacing w:after="80" w:line="300" w:lineRule="auto"/>
+        <w:numPr>
+          <w:ilvl w:val="0"/>
+          <w:numId w:val="15"/>
+        </w:numPr>
+      </w:pPr>
+      <w:r>
+        <w:rPr>
+          <w:rFonts w:ascii="Calibri" w:hAnsi="Calibri" w:eastAsia="Microsoft YaHei"/>
+        </w:rPr>
+        <w:t>闪卡有效数量不足 6 张或缺少证据字段时判定生成无效；Quiz 统一校验答案索引与解析。</w:t>
+      </w:r>
+    </w:p>
+    <w:p>
+      <w:pPr>
+        <w:spacing w:after="80" w:line="300" w:lineRule="auto"/>
+        <w:numPr>
+          <w:ilvl w:val="0"/>
+          <w:numId w:val="15"/>
+        </w:numPr>
+      </w:pPr>
+      <w:r>
+        <w:rPr>
+          <w:rFonts w:ascii="Calibri" w:hAnsi="Calibri" w:eastAsia="Microsoft YaHei"/>
+        </w:rPr>
+        <w:t>Mind map 修复未闭合代码围栏；Markdown 修复破损表格和块边界。</w:t>
+      </w:r>
+    </w:p>
+    <w:p>
+      <w:pPr>
+        <w:spacing w:after="80" w:line="300" w:lineRule="auto"/>
+        <w:numPr>
+          <w:ilvl w:val="0"/>
+          <w:numId w:val="15"/>
+        </w:numPr>
+      </w:pPr>
+      <w:r>
+        <w:rPr>
+          <w:rFonts w:ascii="Calibri" w:hAnsi="Calibri" w:eastAsia="Microsoft YaHei"/>
+        </w:rPr>
+        <w:t>图片模型凭据缺失时给出配置错误，不生成伪图片；播客脚本、图片与 TTS 模型按用途隔离。</w:t>
+      </w:r>
+    </w:p>
+    <w:p>
+      <w:pPr>
+        <w:spacing w:after="80" w:line="300" w:lineRule="auto"/>
+        <w:numPr>
+          <w:ilvl w:val="0"/>
+          <w:numId w:val="15"/>
+        </w:numPr>
+      </w:pPr>
+      <w:r>
+        <w:rPr>
+          <w:rFonts w:ascii="Calibri" w:hAnsi="Calibri" w:eastAsia="Microsoft YaHei"/>
+        </w:rPr>
+        <w:t>讲解视频关键帧间隔、重复提示和总帧数均受约束；合成过程只使用真实 TTS 时间戳。</w:t>
       </w:r>
     </w:p>
     <w:p>
@@ -4166,7 +4406,7 @@
         <w:drawing>
           <wp:inline xmlns:a="http://schemas.openxmlformats.org/drawingml/2006/main" xmlns:pic="http://schemas.openxmlformats.org/drawingml/2006/picture">
             <wp:extent cx="5715000" cy="3572293"/>
-            <wp:docPr id="2" name="Picture 2"/>
+            <wp:docPr id="3" name="Picture 3"/>
             <wp:cNvGraphicFramePr>
               <a:graphicFrameLocks noChangeAspect="1"/>
             </wp:cNvGraphicFramePr>
@@ -4178,7 +4418,7 @@
                     <pic:cNvPicPr/>
                   </pic:nvPicPr>
                   <pic:blipFill>
-                    <a:blip r:embed="rId12"/>
+                    <a:blip r:embed="rId13"/>
                     <a:stretch>
                       <a:fillRect/>
                     </a:stretch>
@@ -4202,7 +4442,7 @@
         <w:pStyle w:val="Caption"/>
       </w:pPr>
       <w:r>
-        <w:t>图 2 真实演示资产：来源约束的知识闪卡</w:t>
+        <w:t>图 3 真实演示资产：来源约束的知识闪卡</w:t>
       </w:r>
     </w:p>
     <w:p>
@@ -4214,7 +4454,7 @@
         <w:drawing>
           <wp:inline xmlns:a="http://schemas.openxmlformats.org/drawingml/2006/main" xmlns:pic="http://schemas.openxmlformats.org/drawingml/2006/picture">
             <wp:extent cx="5715000" cy="3446806"/>
-            <wp:docPr id="3" name="Picture 3"/>
+            <wp:docPr id="4" name="Picture 4"/>
             <wp:cNvGraphicFramePr>
               <a:graphicFrameLocks noChangeAspect="1"/>
             </wp:cNvGraphicFramePr>
@@ -4226,7 +4466,7 @@
                     <pic:cNvPicPr/>
                   </pic:nvPicPr>
                   <pic:blipFill>
-                    <a:blip r:embed="rId13"/>
+                    <a:blip r:embed="rId14"/>
                     <a:stretch>
                       <a:fillRect/>
                     </a:stretch>
@@ -4250,7 +4490,7 @@
         <w:pStyle w:val="Caption"/>
       </w:pPr>
       <w:r>
-        <w:t>图 3 真实演示资产：独立播客与 TTS 管线</w:t>
+        <w:t>图 4 真实演示资产：独立播客与 TTS 管线</w:t>
       </w:r>
     </w:p>
     <w:p>
@@ -5088,8 +5328,8 @@
       <w:r>
         <w:drawing>
           <wp:inline xmlns:a="http://schemas.openxmlformats.org/drawingml/2006/main" xmlns:pic="http://schemas.openxmlformats.org/drawingml/2006/picture">
-            <wp:extent cx="5715000" cy="3810000"/>
-            <wp:docPr id="4" name="Picture 4"/>
+            <wp:extent cx="5897880" cy="3317557"/>
+            <wp:docPr id="5" name="Picture 5"/>
             <wp:cNvGraphicFramePr>
               <a:graphicFrameLocks noChangeAspect="1"/>
             </wp:cNvGraphicFramePr>
@@ -5097,11 +5337,11 @@
               <a:graphicData uri="http://schemas.openxmlformats.org/drawingml/2006/picture">
                 <pic:pic>
                   <pic:nvPicPr>
-                    <pic:cNvPr id="0" name="screenshot-learning-workspace.png"/>
+                    <pic:cNvPr id="0" name="screenshot-learning-workspace-hires.png"/>
                     <pic:cNvPicPr/>
                   </pic:nvPicPr>
                   <pic:blipFill>
-                    <a:blip r:embed="rId14"/>
+                    <a:blip r:embed="rId15"/>
                     <a:stretch>
                       <a:fillRect/>
                     </a:stretch>
@@ -5109,7 +5349,7 @@
                   <pic:spPr>
                     <a:xfrm>
                       <a:off x="0" y="0"/>
-                      <a:ext cx="5715000" cy="3810000"/>
+                      <a:ext cx="5897880" cy="3317557"/>
                     </a:xfrm>
                     <a:prstGeom prst="rect"/>
                   </pic:spPr>
@@ -5125,7 +5365,7 @@
         <w:pStyle w:val="Caption"/>
       </w:pPr>
       <w:r>
-        <w:t>图 4 三栏学习工作台：来源输入、对话辅导与 Studio 资产在同一学习记录中协作</w:t>
+        <w:t>图 5 高清三栏学习工作台：来源输入、对话辅导与 Studio 资产在同一学习记录中协作</w:t>
       </w:r>
     </w:p>
     <w:p>
@@ -6257,7 +6497,7 @@
                 <w:color w:val="111827"/>
                 <w:sz w:val="17"/>
               </w:rPr>
-              <w:t>数据与任务层</w:t>
+              <w:t>媒体合成层</w:t>
             </w:r>
           </w:p>
         </w:tc>
@@ -6282,7 +6522,7 @@
                 <w:color w:val="111827"/>
                 <w:sz w:val="17"/>
               </w:rPr>
-              <w:t>SurrealDB / surreal-commands</w:t>
+              <w:t>FFmpeg</w:t>
             </w:r>
           </w:p>
         </w:tc>
@@ -6307,7 +6547,7 @@
                 <w:color w:val="111827"/>
                 <w:sz w:val="17"/>
               </w:rPr>
-              <w:t>来源、资产、画像、模型、凭据、后台任务与日志</w:t>
+              <w:t>依据真实 TTS 时间轴合成讲解视频；不调用视频生成服务</w:t>
             </w:r>
           </w:p>
         </w:tc>
@@ -6336,7 +6576,7 @@
                 <w:color w:val="111827"/>
                 <w:sz w:val="17"/>
               </w:rPr>
-              <w:t>桌面交付层</w:t>
+              <w:t>数据与任务层</w:t>
             </w:r>
           </w:p>
         </w:tc>
@@ -6362,6 +6602,85 @@
                 <w:color w:val="111827"/>
                 <w:sz w:val="17"/>
               </w:rPr>
+              <w:t>SurrealDB / surreal-commands</w:t>
+            </w:r>
+          </w:p>
+        </w:tc>
+        <w:tc>
+          <w:tcPr>
+            <w:tcW w:type="dxa" w:w="4460"/>
+            <w:shd w:fill="FAFCFE"/>
+            <w:tcMar>
+              <w:top w:w="80" w:type="dxa"/>
+              <w:bottom w:w="80" w:type="dxa"/>
+              <w:start w:w="120" w:type="dxa"/>
+              <w:end w:w="120" w:type="dxa"/>
+            </w:tcMar>
+            <w:vAlign w:val="center"/>
+          </w:tcPr>
+          <w:p>
+            <w:pPr>
+              <w:spacing w:after="0" w:line="276" w:lineRule="auto"/>
+            </w:pPr>
+            <w:r>
+              <w:rPr>
+                <w:rFonts w:ascii="Calibri" w:hAnsi="Calibri" w:eastAsia="Microsoft YaHei"/>
+                <w:color w:val="111827"/>
+                <w:sz w:val="17"/>
+              </w:rPr>
+              <w:t>来源、资产、画像、模型、凭据、后台任务与日志</w:t>
+            </w:r>
+          </w:p>
+        </w:tc>
+      </w:tr>
+      <w:tr>
+        <w:tc>
+          <w:tcPr>
+            <w:tcW w:type="dxa" w:w="1600"/>
+            <w:tcMar>
+              <w:top w:w="80" w:type="dxa"/>
+              <w:bottom w:w="80" w:type="dxa"/>
+              <w:start w:w="120" w:type="dxa"/>
+              <w:end w:w="120" w:type="dxa"/>
+            </w:tcMar>
+            <w:vAlign w:val="center"/>
+          </w:tcPr>
+          <w:p>
+            <w:pPr>
+              <w:spacing w:after="0" w:line="276" w:lineRule="auto"/>
+              <w:jc w:val="center"/>
+            </w:pPr>
+            <w:r>
+              <w:rPr>
+                <w:rFonts w:ascii="Calibri" w:hAnsi="Calibri" w:eastAsia="Microsoft YaHei"/>
+                <w:color w:val="111827"/>
+                <w:sz w:val="17"/>
+              </w:rPr>
+              <w:t>桌面交付层</w:t>
+            </w:r>
+          </w:p>
+        </w:tc>
+        <w:tc>
+          <w:tcPr>
+            <w:tcW w:type="dxa" w:w="3300"/>
+            <w:tcMar>
+              <w:top w:w="80" w:type="dxa"/>
+              <w:bottom w:w="80" w:type="dxa"/>
+              <w:start w:w="120" w:type="dxa"/>
+              <w:end w:w="120" w:type="dxa"/>
+            </w:tcMar>
+            <w:vAlign w:val="center"/>
+          </w:tcPr>
+          <w:p>
+            <w:pPr>
+              <w:spacing w:after="0" w:line="276" w:lineRule="auto"/>
+            </w:pPr>
+            <w:r>
+              <w:rPr>
+                <w:rFonts w:ascii="Calibri" w:hAnsi="Calibri" w:eastAsia="Microsoft YaHei"/>
+                <w:color w:val="111827"/>
+                <w:sz w:val="17"/>
+              </w:rPr>
               <w:t>pywebview / WebView2 / Inno Setup</w:t>
             </w:r>
           </w:p>
@@ -6369,7 +6688,6 @@
         <w:tc>
           <w:tcPr>
             <w:tcW w:type="dxa" w:w="4460"/>
-            <w:shd w:fill="FAFCFE"/>
             <w:tcMar>
               <w:top w:w="80" w:type="dxa"/>
               <w:bottom w:w="80" w:type="dxa"/>
@@ -6412,7 +6730,7 @@
         <w:rPr>
           <w:rFonts w:ascii="Calibri" w:hAnsi="Calibri" w:eastAsia="Microsoft YaHei"/>
         </w:rPr>
-        <w:t>系统不把所有任务绑定到一个默认模型，而是提供 chat、rag、resource_search、learning_asset、study_guide、quiz、flashcards、mind_map、reading、code_lab、podcast、embedding、image、text_to_speech、speech_to_text 等用途。单一资产生成时优先选择对应模型，多资产批量生成时使用 learning_asset 模型。</w:t>
+        <w:t>系统按用途提供 chat、rag、resource_search、learning_asset、study_guide、quiz、flashcards、mind_map、reading、code_lab、podcast、embedding、image、text_to_speech、speech_to_text 等用途。单一资产生成时优先选择对应模型，多资产批量生成时使用 learning_asset 模型；讲解视频复用 podcast、image 和 text_to_speech，因此无需新增视频模型配置。</w:t>
       </w:r>
     </w:p>
     <w:p>
@@ -6424,7 +6742,7 @@
         <w:drawing>
           <wp:inline xmlns:a="http://schemas.openxmlformats.org/drawingml/2006/main" xmlns:pic="http://schemas.openxmlformats.org/drawingml/2006/picture">
             <wp:extent cx="5715000" cy="3810000"/>
-            <wp:docPr id="5" name="Picture 5"/>
+            <wp:docPr id="6" name="Picture 6"/>
             <wp:cNvGraphicFramePr>
               <a:graphicFrameLocks noChangeAspect="1"/>
             </wp:cNvGraphicFramePr>
@@ -6436,7 +6754,7 @@
                     <pic:cNvPicPr/>
                   </pic:nvPicPr>
                   <pic:blipFill>
-                    <a:blip r:embed="rId15"/>
+                    <a:blip r:embed="rId16"/>
                     <a:stretch>
                       <a:fillRect/>
                     </a:stretch>
@@ -6460,7 +6778,7 @@
         <w:pStyle w:val="Caption"/>
       </w:pPr>
       <w:r>
-        <w:t>图 5 模型/API 配置：基础默认项与按学习用途覆盖</w:t>
+        <w:t>图 6 模型/API 配置：基础默认项与按学习用途覆盖</w:t>
       </w:r>
     </w:p>
     <w:p>
@@ -6476,7 +6794,7 @@
         <w:spacing w:after="80" w:line="300" w:lineRule="auto"/>
         <w:numPr>
           <w:ilvl w:val="0"/>
-          <w:numId w:val="15"/>
+          <w:numId w:val="16"/>
         </w:numPr>
       </w:pPr>
       <w:r>
@@ -6491,7 +6809,7 @@
         <w:spacing w:after="80" w:line="300" w:lineRule="auto"/>
         <w:numPr>
           <w:ilvl w:val="0"/>
-          <w:numId w:val="15"/>
+          <w:numId w:val="16"/>
         </w:numPr>
       </w:pPr>
       <w:r>
@@ -6506,14 +6824,14 @@
         <w:spacing w:after="80" w:line="300" w:lineRule="auto"/>
         <w:numPr>
           <w:ilvl w:val="0"/>
-          <w:numId w:val="15"/>
+          <w:numId w:val="16"/>
         </w:numPr>
       </w:pPr>
       <w:r>
         <w:rPr>
           <w:rFonts w:ascii="Calibri" w:hAnsi="Calibri" w:eastAsia="Microsoft YaHei"/>
         </w:rPr>
-        <w:t>右侧 Studio 以学习动作而不是模型名称组织入口，降低非技术用户配置成本。</w:t>
+        <w:t>右侧 Studio 按课程讲解、测验、闪卡、导图、图片、播客等学习动作组织入口，降低非技术用户配置成本。</w:t>
       </w:r>
     </w:p>
     <w:p>
@@ -6521,7 +6839,7 @@
         <w:spacing w:after="80" w:line="300" w:lineRule="auto"/>
         <w:numPr>
           <w:ilvl w:val="0"/>
-          <w:numId w:val="15"/>
+          <w:numId w:val="16"/>
         </w:numPr>
       </w:pPr>
       <w:r>
@@ -6536,7 +6854,7 @@
         <w:spacing w:after="80" w:line="300" w:lineRule="auto"/>
         <w:numPr>
           <w:ilvl w:val="0"/>
-          <w:numId w:val="15"/>
+          <w:numId w:val="16"/>
         </w:numPr>
       </w:pPr>
       <w:r>
@@ -6551,7 +6869,7 @@
         <w:spacing w:after="80" w:line="300" w:lineRule="auto"/>
         <w:numPr>
           <w:ilvl w:val="0"/>
-          <w:numId w:val="15"/>
+          <w:numId w:val="16"/>
         </w:numPr>
       </w:pPr>
       <w:r>
@@ -7005,6 +7323,114 @@
                 <w:color w:val="111827"/>
                 <w:sz w:val="17"/>
               </w:rPr>
+              <w:t>POST /api/podcasts/generate</w:t>
+            </w:r>
+          </w:p>
+        </w:tc>
+        <w:tc>
+          <w:tcPr>
+            <w:tcW w:type="dxa" w:w="5760"/>
+            <w:tcMar>
+              <w:top w:w="80" w:type="dxa"/>
+              <w:bottom w:w="80" w:type="dxa"/>
+              <w:start w:w="120" w:type="dxa"/>
+              <w:end w:w="120" w:type="dxa"/>
+            </w:tcMar>
+            <w:vAlign w:val="center"/>
+          </w:tcPr>
+          <w:p>
+            <w:pPr>
+              <w:spacing w:after="0" w:line="276" w:lineRule="auto"/>
+            </w:pPr>
+            <w:r>
+              <w:rPr>
+                <w:rFonts w:ascii="Calibri" w:hAnsi="Calibri" w:eastAsia="Microsoft YaHei"/>
+                <w:color w:val="111827"/>
+                <w:sz w:val="17"/>
+              </w:rPr>
+              <w:t>提交播客任务，并可通过 generate_video 选择讲解视频</w:t>
+            </w:r>
+          </w:p>
+        </w:tc>
+      </w:tr>
+      <w:tr>
+        <w:tc>
+          <w:tcPr>
+            <w:tcW w:type="dxa" w:w="3600"/>
+            <w:shd w:fill="FAFCFE"/>
+            <w:tcMar>
+              <w:top w:w="80" w:type="dxa"/>
+              <w:bottom w:w="80" w:type="dxa"/>
+              <w:start w:w="120" w:type="dxa"/>
+              <w:end w:w="120" w:type="dxa"/>
+            </w:tcMar>
+            <w:vAlign w:val="center"/>
+          </w:tcPr>
+          <w:p>
+            <w:pPr>
+              <w:spacing w:after="0" w:line="276" w:lineRule="auto"/>
+              <w:jc w:val="center"/>
+            </w:pPr>
+            <w:r>
+              <w:rPr>
+                <w:rFonts w:ascii="Calibri" w:hAnsi="Calibri" w:eastAsia="Microsoft YaHei"/>
+                <w:color w:val="111827"/>
+                <w:sz w:val="17"/>
+              </w:rPr>
+              <w:t>GET /api/podcasts/episodes/{id}/video</w:t>
+            </w:r>
+          </w:p>
+        </w:tc>
+        <w:tc>
+          <w:tcPr>
+            <w:tcW w:type="dxa" w:w="5760"/>
+            <w:shd w:fill="FAFCFE"/>
+            <w:tcMar>
+              <w:top w:w="80" w:type="dxa"/>
+              <w:bottom w:w="80" w:type="dxa"/>
+              <w:start w:w="120" w:type="dxa"/>
+              <w:end w:w="120" w:type="dxa"/>
+            </w:tcMar>
+            <w:vAlign w:val="center"/>
+          </w:tcPr>
+          <w:p>
+            <w:pPr>
+              <w:spacing w:after="0" w:line="276" w:lineRule="auto"/>
+            </w:pPr>
+            <w:r>
+              <w:rPr>
+                <w:rFonts w:ascii="Calibri" w:hAnsi="Calibri" w:eastAsia="Microsoft YaHei"/>
+                <w:color w:val="111827"/>
+                <w:sz w:val="17"/>
+              </w:rPr>
+              <w:t>读取已合成的讲解视频</w:t>
+            </w:r>
+          </w:p>
+        </w:tc>
+      </w:tr>
+      <w:tr>
+        <w:tc>
+          <w:tcPr>
+            <w:tcW w:type="dxa" w:w="3600"/>
+            <w:tcMar>
+              <w:top w:w="80" w:type="dxa"/>
+              <w:bottom w:w="80" w:type="dxa"/>
+              <w:start w:w="120" w:type="dxa"/>
+              <w:end w:w="120" w:type="dxa"/>
+            </w:tcMar>
+            <w:vAlign w:val="center"/>
+          </w:tcPr>
+          <w:p>
+            <w:pPr>
+              <w:spacing w:after="0" w:line="276" w:lineRule="auto"/>
+              <w:jc w:val="center"/>
+            </w:pPr>
+            <w:r>
+              <w:rPr>
+                <w:rFonts w:ascii="Calibri" w:hAnsi="Calibri" w:eastAsia="Microsoft YaHei"/>
+                <w:color w:val="111827"/>
+                <w:sz w:val="17"/>
+              </w:rPr>
               <w:t>/api/search 与 /api/context</w:t>
             </w:r>
           </w:p>
@@ -7150,7 +7576,7 @@
                 <w:rFonts w:ascii="Calibri" w:hAnsi="Calibri" w:eastAsia="Microsoft YaHei"/>
                 <w:b/>
                 <w:color w:val="0B2545"/>
-                <w:sz w:val="19"/>
+                <w:sz w:val="18"/>
               </w:rPr>
               <w:t>对象</w:t>
             </w:r>
@@ -7178,7 +7604,7 @@
                 <w:rFonts w:ascii="Calibri" w:hAnsi="Calibri" w:eastAsia="Microsoft YaHei"/>
                 <w:b/>
                 <w:color w:val="0B2545"/>
-                <w:sz w:val="19"/>
+                <w:sz w:val="18"/>
               </w:rPr>
               <w:t>内容</w:t>
             </w:r>
@@ -7206,7 +7632,7 @@
               <w:rPr>
                 <w:rFonts w:ascii="Calibri" w:hAnsi="Calibri" w:eastAsia="Microsoft YaHei"/>
                 <w:color w:val="111827"/>
-                <w:sz w:val="18"/>
+                <w:sz w:val="17"/>
               </w:rPr>
               <w:t>notebook</w:t>
             </w:r>
@@ -7231,7 +7657,7 @@
               <w:rPr>
                 <w:rFonts w:ascii="Calibri" w:hAnsi="Calibri" w:eastAsia="Microsoft YaHei"/>
                 <w:color w:val="111827"/>
-                <w:sz w:val="18"/>
+                <w:sz w:val="17"/>
               </w:rPr>
               <w:t>课程学习记录及归档状态</w:t>
             </w:r>
@@ -7260,7 +7686,7 @@
               <w:rPr>
                 <w:rFonts w:ascii="Calibri" w:hAnsi="Calibri" w:eastAsia="Microsoft YaHei"/>
                 <w:color w:val="111827"/>
-                <w:sz w:val="18"/>
+                <w:sz w:val="17"/>
               </w:rPr>
               <w:t>source / source_embedding</w:t>
             </w:r>
@@ -7286,7 +7712,7 @@
               <w:rPr>
                 <w:rFonts w:ascii="Calibri" w:hAnsi="Calibri" w:eastAsia="Microsoft YaHei"/>
                 <w:color w:val="111827"/>
-                <w:sz w:val="18"/>
+                <w:sz w:val="17"/>
               </w:rPr>
               <w:t>原始资料、全文、主题、分块向量与索引信息</w:t>
             </w:r>
@@ -7314,7 +7740,7 @@
               <w:rPr>
                 <w:rFonts w:ascii="Calibri" w:hAnsi="Calibri" w:eastAsia="Microsoft YaHei"/>
                 <w:color w:val="111827"/>
-                <w:sz w:val="18"/>
+                <w:sz w:val="17"/>
               </w:rPr>
               <w:t>note / artifact</w:t>
             </w:r>
@@ -7339,7 +7765,7 @@
               <w:rPr>
                 <w:rFonts w:ascii="Calibri" w:hAnsi="Calibri" w:eastAsia="Microsoft YaHei"/>
                 <w:color w:val="111827"/>
-                <w:sz w:val="18"/>
+                <w:sz w:val="17"/>
               </w:rPr>
               <w:t>人类笔记与生成学习资产及 notebook 关联</w:t>
             </w:r>
@@ -7368,7 +7794,7 @@
               <w:rPr>
                 <w:rFonts w:ascii="Calibri" w:hAnsi="Calibri" w:eastAsia="Microsoft YaHei"/>
                 <w:color w:val="111827"/>
-                <w:sz w:val="18"/>
+                <w:sz w:val="17"/>
               </w:rPr>
               <w:t>model / default models</w:t>
             </w:r>
@@ -7394,7 +7820,7 @@
               <w:rPr>
                 <w:rFonts w:ascii="Calibri" w:hAnsi="Calibri" w:eastAsia="Microsoft YaHei"/>
                 <w:color w:val="111827"/>
-                <w:sz w:val="18"/>
+                <w:sz w:val="17"/>
               </w:rPr>
               <w:t>模型、供应商、协议和按用途默认配置</w:t>
             </w:r>
@@ -7422,7 +7848,7 @@
               <w:rPr>
                 <w:rFonts w:ascii="Calibri" w:hAnsi="Calibri" w:eastAsia="Microsoft YaHei"/>
                 <w:color w:val="111827"/>
-                <w:sz w:val="18"/>
+                <w:sz w:val="17"/>
               </w:rPr>
               <w:t>credential</w:t>
             </w:r>
@@ -7447,7 +7873,7 @@
               <w:rPr>
                 <w:rFonts w:ascii="Calibri" w:hAnsi="Calibri" w:eastAsia="Microsoft YaHei"/>
                 <w:color w:val="111827"/>
-                <w:sz w:val="18"/>
+                <w:sz w:val="17"/>
               </w:rPr>
               <w:t>加密后的 API key 与各协议端点</w:t>
             </w:r>
@@ -7476,7 +7902,7 @@
               <w:rPr>
                 <w:rFonts w:ascii="Calibri" w:hAnsi="Calibri" w:eastAsia="Microsoft YaHei"/>
                 <w:color w:val="111827"/>
-                <w:sz w:val="18"/>
+                <w:sz w:val="17"/>
               </w:rPr>
               <w:t>command job</w:t>
             </w:r>
@@ -7502,7 +7928,7 @@
               <w:rPr>
                 <w:rFonts w:ascii="Calibri" w:hAnsi="Calibri" w:eastAsia="Microsoft YaHei"/>
                 <w:color w:val="111827"/>
-                <w:sz w:val="18"/>
+                <w:sz w:val="17"/>
               </w:rPr>
               <w:t>后台任务参数、状态、日志、结果和运行时间</w:t>
             </w:r>
@@ -7530,7 +7956,7 @@
               <w:rPr>
                 <w:rFonts w:ascii="Calibri" w:hAnsi="Calibri" w:eastAsia="Microsoft YaHei"/>
                 <w:color w:val="111827"/>
-                <w:sz w:val="18"/>
+                <w:sz w:val="17"/>
               </w:rPr>
               <w:t>podcast episode</w:t>
             </w:r>
@@ -7555,9 +7981,9 @@
               <w:rPr>
                 <w:rFonts w:ascii="Calibri" w:hAnsi="Calibri" w:eastAsia="Microsoft YaHei"/>
                 <w:color w:val="111827"/>
-                <w:sz w:val="18"/>
+                <w:sz w:val="17"/>
               </w:rPr>
-              <w:t>播客脚本、音频与所属 notebook</w:t>
+              <w:t>播客脚本、音频、讲解视频、关键帧计划与所属 notebook</w:t>
             </w:r>
           </w:p>
         </w:tc>
@@ -7950,7 +8376,7 @@
         <w:spacing w:after="80" w:line="300" w:lineRule="auto"/>
         <w:numPr>
           <w:ilvl w:val="0"/>
-          <w:numId w:val="16"/>
+          <w:numId w:val="17"/>
         </w:numPr>
       </w:pPr>
       <w:r>
@@ -7965,7 +8391,7 @@
         <w:spacing w:after="80" w:line="300" w:lineRule="auto"/>
         <w:numPr>
           <w:ilvl w:val="0"/>
-          <w:numId w:val="16"/>
+          <w:numId w:val="17"/>
         </w:numPr>
       </w:pPr>
       <w:r>
@@ -7980,7 +8406,7 @@
         <w:spacing w:after="80" w:line="300" w:lineRule="auto"/>
         <w:numPr>
           <w:ilvl w:val="0"/>
-          <w:numId w:val="16"/>
+          <w:numId w:val="17"/>
         </w:numPr>
       </w:pPr>
       <w:r>
@@ -7995,7 +8421,7 @@
         <w:spacing w:after="80" w:line="300" w:lineRule="auto"/>
         <w:numPr>
           <w:ilvl w:val="0"/>
-          <w:numId w:val="16"/>
+          <w:numId w:val="17"/>
         </w:numPr>
       </w:pPr>
       <w:r>
@@ -8187,7 +8613,7 @@
                 <w:color w:val="111827"/>
                 <w:sz w:val="18"/>
               </w:rPr>
-              <w:t>273 passed</w:t>
+              <w:t>282 passed</w:t>
             </w:r>
           </w:p>
         </w:tc>
@@ -8267,7 +8693,7 @@
                 <w:color w:val="111827"/>
                 <w:sz w:val="18"/>
               </w:rPr>
-              <w:t>30 passed</w:t>
+              <w:t>31 passed</w:t>
             </w:r>
           </w:p>
         </w:tc>
@@ -8293,7 +8719,7 @@
                 <w:color w:val="111827"/>
                 <w:sz w:val="18"/>
               </w:rPr>
-              <w:t>learning service/API/专项验收</w:t>
+              <w:t>learning service/API/A3 专项验收</w:t>
             </w:r>
           </w:p>
         </w:tc>
@@ -8346,7 +8772,7 @@
                 <w:color w:val="111827"/>
                 <w:sz w:val="18"/>
               </w:rPr>
-              <w:t>7 passed</w:t>
+              <w:t>8 passed</w:t>
             </w:r>
           </w:p>
         </w:tc>
@@ -8371,7 +8797,7 @@
                 <w:color w:val="111827"/>
                 <w:sz w:val="18"/>
               </w:rPr>
-              <w:t>6 维画像、9 智能体、7 资产、路径、安全、画像、流式</w:t>
+              <w:t>画像、9 智能体、7 资产、路径、安全、流式与视频时间轴</w:t>
             </w:r>
           </w:p>
         </w:tc>
@@ -8400,7 +8826,7 @@
                 <w:color w:val="111827"/>
                 <w:sz w:val="18"/>
               </w:rPr>
-              <w:t>前端单元/组件</w:t>
+              <w:t>讲解视频专项</w:t>
             </w:r>
           </w:p>
         </w:tc>
@@ -8426,6 +8852,85 @@
                 <w:color w:val="111827"/>
                 <w:sz w:val="18"/>
               </w:rPr>
+              <w:t>8 passed</w:t>
+            </w:r>
+          </w:p>
+        </w:tc>
+        <w:tc>
+          <w:tcPr>
+            <w:tcW w:type="dxa" w:w="4760"/>
+            <w:shd w:fill="FAFCFE"/>
+            <w:tcMar>
+              <w:top w:w="80" w:type="dxa"/>
+              <w:bottom w:w="80" w:type="dxa"/>
+              <w:start w:w="120" w:type="dxa"/>
+              <w:end w:w="120" w:type="dxa"/>
+            </w:tcMar>
+            <w:vAlign w:val="center"/>
+          </w:tcPr>
+          <w:p>
+            <w:pPr>
+              <w:spacing w:after="0" w:line="276" w:lineRule="auto"/>
+            </w:pPr>
+            <w:r>
+              <w:rPr>
+                <w:rFonts w:ascii="Calibri" w:hAnsi="Calibri" w:eastAsia="Microsoft YaHei"/>
+                <w:color w:val="111827"/>
+                <w:sz w:val="18"/>
+              </w:rPr>
+              <w:t>脚本提示、时间轴、图片落盘、真实 FFmpeg 合成</w:t>
+            </w:r>
+          </w:p>
+        </w:tc>
+      </w:tr>
+      <w:tr>
+        <w:tc>
+          <w:tcPr>
+            <w:tcW w:type="dxa" w:w="2300"/>
+            <w:tcMar>
+              <w:top w:w="80" w:type="dxa"/>
+              <w:bottom w:w="80" w:type="dxa"/>
+              <w:start w:w="120" w:type="dxa"/>
+              <w:end w:w="120" w:type="dxa"/>
+            </w:tcMar>
+            <w:vAlign w:val="center"/>
+          </w:tcPr>
+          <w:p>
+            <w:pPr>
+              <w:spacing w:after="0" w:line="276" w:lineRule="auto"/>
+              <w:jc w:val="center"/>
+            </w:pPr>
+            <w:r>
+              <w:rPr>
+                <w:rFonts w:ascii="Calibri" w:hAnsi="Calibri" w:eastAsia="Microsoft YaHei"/>
+                <w:color w:val="111827"/>
+                <w:sz w:val="18"/>
+              </w:rPr>
+              <w:t>前端单元/组件</w:t>
+            </w:r>
+          </w:p>
+        </w:tc>
+        <w:tc>
+          <w:tcPr>
+            <w:tcW w:type="dxa" w:w="2300"/>
+            <w:tcMar>
+              <w:top w:w="80" w:type="dxa"/>
+              <w:bottom w:w="80" w:type="dxa"/>
+              <w:start w:w="120" w:type="dxa"/>
+              <w:end w:w="120" w:type="dxa"/>
+            </w:tcMar>
+            <w:vAlign w:val="center"/>
+          </w:tcPr>
+          <w:p>
+            <w:pPr>
+              <w:spacing w:after="0" w:line="276" w:lineRule="auto"/>
+            </w:pPr>
+            <w:r>
+              <w:rPr>
+                <w:rFonts w:ascii="Calibri" w:hAnsi="Calibri" w:eastAsia="Microsoft YaHei"/>
+                <w:color w:val="111827"/>
+                <w:sz w:val="18"/>
+              </w:rPr>
               <w:t>10 files / 55 tests passed</w:t>
             </w:r>
           </w:p>
@@ -8433,7 +8938,6 @@
         <w:tc>
           <w:tcPr>
             <w:tcW w:type="dxa" w:w="4760"/>
-            <w:shd w:fill="FAFCFE"/>
             <w:tcMar>
               <w:top w:w="80" w:type="dxa"/>
               <w:bottom w:w="80" w:type="dxa"/>
@@ -8468,7 +8972,7 @@
         <w:rPr>
           <w:rFonts w:ascii="Calibri" w:hAnsi="Calibri" w:eastAsia="Microsoft YaHei"/>
         </w:rPr>
-        <w:t>测试说明书已改为按真实执行范围报告，并附专项测试源码与 JUnit 结果截图。完整代码见 tests/test_submission_acceptance.py。</w:t>
+        <w:t>测试结果按实际执行范围分别列出。测试说明书附有 tests/test_submission_acceptance.py、tests/test_explainer_video.py和两组 8/8 通过截图，便于在答辩现场复现。</w:t>
       </w:r>
     </w:p>
     <w:p>
@@ -9125,14 +9629,14 @@
         <w:spacing w:after="80" w:line="300" w:lineRule="auto"/>
         <w:numPr>
           <w:ilvl w:val="0"/>
-          <w:numId w:val="17"/>
+          <w:numId w:val="18"/>
         </w:numPr>
       </w:pPr>
       <w:r>
         <w:rPr>
           <w:rFonts w:ascii="Calibri" w:hAnsi="Calibri" w:eastAsia="Microsoft YaHei"/>
         </w:rPr>
-        <w:t>真实大模型、图片和播客端到端质量受用户模型凭据、额度与网络影响；离线测试验证的是系统契约和失败处理。</w:t>
+        <w:t>真实大模型、图片、播客与讲解视频的内容质量受用户模型凭据、额度与网络影响；离线测试验证系统契约和失败处理。</w:t>
       </w:r>
     </w:p>
     <w:p>
@@ -9140,14 +9644,14 @@
         <w:spacing w:after="80" w:line="300" w:lineRule="auto"/>
         <w:numPr>
           <w:ilvl w:val="0"/>
-          <w:numId w:val="17"/>
+          <w:numId w:val="18"/>
         </w:numPr>
       </w:pPr>
       <w:r>
         <w:rPr>
           <w:rFonts w:ascii="Calibri" w:hAnsi="Calibri" w:eastAsia="Microsoft YaHei"/>
         </w:rPr>
-        <w:t>当前多模态重点为文本、结构化题库、图谱、代码、图片和音频，尚未直接生成视频/动画。</w:t>
+        <w:t>讲解视频采用关键静帧与语音合成，适合知识讲解；当前版本不生成连续角色动作、复杂动画或口型同步。</w:t>
       </w:r>
     </w:p>
     <w:p>
@@ -9155,14 +9659,14 @@
         <w:spacing w:after="80" w:line="300" w:lineRule="auto"/>
         <w:numPr>
           <w:ilvl w:val="0"/>
-          <w:numId w:val="17"/>
+          <w:numId w:val="18"/>
         </w:numPr>
       </w:pPr>
       <w:r>
         <w:rPr>
           <w:rFonts w:ascii="Calibri" w:hAnsi="Calibri" w:eastAsia="Microsoft YaHei"/>
         </w:rPr>
-        <w:t>尚未开展生产级多租户隔离、长时间稳定性和大规模并发压测。</w:t>
+        <w:t>生产级多租户隔离、长时间稳定性和大规模并发压测仍需在部署环境中补充。</w:t>
       </w:r>
     </w:p>
     <w:p>
@@ -9170,7 +9674,7 @@
         <w:spacing w:after="80" w:line="300" w:lineRule="auto"/>
         <w:numPr>
           <w:ilvl w:val="0"/>
-          <w:numId w:val="17"/>
+          <w:numId w:val="18"/>
         </w:numPr>
       </w:pPr>
       <w:r>
@@ -9185,7 +9689,7 @@
         <w:spacing w:after="80" w:line="300" w:lineRule="auto"/>
         <w:numPr>
           <w:ilvl w:val="0"/>
-          <w:numId w:val="17"/>
+          <w:numId w:val="18"/>
         </w:numPr>
       </w:pPr>
       <w:r>
@@ -9582,7 +10086,7 @@
                 <w:color w:val="111827"/>
                 <w:sz w:val="18"/>
               </w:rPr>
-              <w:t>播客与 TTS</w:t>
+              <w:t>播客、TTS 与讲解视频</w:t>
             </w:r>
           </w:p>
         </w:tc>
@@ -9608,7 +10112,7 @@
                 <w:color w:val="111827"/>
                 <w:sz w:val="18"/>
               </w:rPr>
-              <w:t>api/podcast_service.py；forgenote/podcasts/robust_creator.py</w:t>
+              <w:t>api/podcast_service.py；forgenote/podcasts/robust_creator.py；forgenote/podcasts/video_creator.py</w:t>
             </w:r>
           </w:p>
         </w:tc>
@@ -9716,7 +10220,7 @@
                 <w:color w:val="111827"/>
                 <w:sz w:val="18"/>
               </w:rPr>
-              <w:t>tests/test_submission_acceptance.py</w:t>
+              <w:t>tests/test_submission_acceptance.py；tests/test_explainer_video.py</w:t>
             </w:r>
           </w:p>
         </w:tc>
@@ -10120,8 +10624,8 @@
     <w:multiLevelType w:val="singleLevel"/>
     <w:lvl w:ilvl="0">
       <w:start w:val="1"/>
-      <w:numFmt w:val="bullet"/>
-      <w:lvlText w:val="•"/>
+      <w:numFmt w:val="decimal"/>
+      <w:lvlText w:val="%1."/>
       <w:suff w:val="tab"/>
       <w:pPr>
         <w:tabs>
@@ -10191,6 +10695,25 @@
   </w:abstractNum>
   <w:num w:numId="17">
     <w:abstractNumId w:val="16"/>
+  </w:num>
+  <w:abstractNum w:abstractNumId="17">
+    <w:multiLevelType w:val="singleLevel"/>
+    <w:lvl w:ilvl="0">
+      <w:start w:val="1"/>
+      <w:numFmt w:val="bullet"/>
+      <w:lvlText w:val="•"/>
+      <w:suff w:val="tab"/>
+      <w:pPr>
+        <w:tabs>
+          <w:tab w:val="num" w:pos="540"/>
+        </w:tabs>
+        <w:ind w:left="540" w:hanging="271"/>
+        <w:spacing w:after="80" w:line="300" w:lineRule="auto"/>
+      </w:pPr>
+    </w:lvl>
+  </w:abstractNum>
+  <w:num w:numId="18">
+    <w:abstractNumId w:val="17"/>
   </w:num>
 </w:numbering>
 </file>

</xml_diff>

<commit_message>
feat: add subtitled explainer media to submission
</commit_message>
<xml_diff>
--- a/to_be_submitted_docs/开发说明书.docx
+++ b/to_be_submitted_docs/开发说明书.docx
@@ -21,7 +21,7 @@
         <w:pStyle w:val="DocTitle"/>
       </w:pPr>
       <w:r>
-        <w:t>ForgeNote 系统开发说明书</w:t>
+        <w:t>Forgenote 系统开发说明书</w:t>
       </w:r>
     </w:p>
     <w:p>
@@ -100,7 +100,7 @@
                 <w:color w:val="111827"/>
                 <w:sz w:val="19"/>
               </w:rPr>
-              <w:t>ForgeNote（智学工坊）个性化学习多智能体系统</w:t>
+              <w:t>Forgenote（智学工坊）个性化学习多智能体系统</w:t>
             </w:r>
           </w:p>
         </w:tc>
@@ -206,7 +206,7 @@
                 <w:color w:val="111827"/>
                 <w:sz w:val="19"/>
               </w:rPr>
-              <w:t>V2.1（多模态讲解视频版）</w:t>
+              <w:t>V2.2（带字幕讲解视频版）</w:t>
             </w:r>
           </w:p>
         </w:tc>
@@ -316,7 +316,7 @@
                 <w:color w:val="111827"/>
                 <w:sz w:val="21"/>
               </w:rPr>
-              <w:t>项目的核心创新是由 9 个职责清晰、过程可观测的智能体共同维护学习闭环，并将文本、结构化题库、图谱、代码、图片、播客和讲解视频统一纳入来源约束的生成体系。学习画像、课程资料、练习反馈和路径调整在同一学习记录中持续积累，学生可以核验来源、观察过程并修正画像。</w:t>
+              <w:t>项目的核心创新是由 9 个职责清晰、过程可观测的智能体共同维护学习闭环，并将文本、结构化题库、图谱、代码、图片、播客和带字幕讲解视频统一纳入来源约束的生成体系。学习画像、课程资料、练习反馈和路径调整在同一学习记录中持续积累，学生可以核验来源、观察过程并修正画像。</w:t>
             </w:r>
           </w:p>
         </w:tc>
@@ -345,7 +345,7 @@
         <w:rPr>
           <w:rFonts w:ascii="Calibri" w:hAnsi="Calibri" w:eastAsia="Microsoft YaHei"/>
         </w:rPr>
-        <w:t>ForgeNote 面向高校课程自主学习场景，基于 Open Notebook 的资料、笔记与 RAG 底座进行赛题化二次开发。系统把被动的资料问答升级为主动学习工作台：学生通过自然语言表达背景与目标，系统维护动态画像，由多角色智能体协同完成资料搜集、资源生成、练习、路径规划、即时辅导、效果评估与安全检查。</w:t>
+        <w:t>Forgenote 面向高校课程自主学习场景，基于 Open Notebook 的资料、笔记与 RAG 底座进行赛题化二次开发。系统把被动的资料问答升级为主动学习工作台：学生通过自然语言表达背景与目标，系统维护动态画像，由多角色智能体协同完成资料搜集、资源生成、练习、路径规划、即时辅导、效果评估与安全检查。</w:t>
       </w:r>
     </w:p>
     <w:p>
@@ -353,7 +353,7 @@
         <w:rPr>
           <w:rFonts w:ascii="Calibri" w:hAnsi="Calibri" w:eastAsia="Microsoft YaHei"/>
         </w:rPr>
-        <w:t>本说明书以当前仓库代码和 2026 年 7 月 19 日实测结果为依据。重点展开 5 项创新：画像即来源（Profile-as-Source）、9 角色模式路由、来源约束的多模态资产流水线、基于真实语音时间轴的讲解视频生成，以及长任务可观测与防幻觉阻断。</w:t>
+        <w:t>本说明书以当前仓库代码和 2026 年 7 月 19 日实测结果为依据。重点展开 5 项创新：画像即来源（Profile-as-Source）、9 角色模式路由、来源约束的多模态资产流水线、基于真实语音时间轴的带字幕讲解视频生成，以及长任务可观测与防幻觉阻断。</w:t>
       </w:r>
     </w:p>
     <w:p>
@@ -441,7 +441,7 @@
                 <w:color w:val="0B2545"/>
                 <w:sz w:val="18"/>
               </w:rPr>
-              <w:t>ForgeNote 落地</w:t>
+              <w:t>Forgenote 落地</w:t>
             </w:r>
           </w:p>
         </w:tc>
@@ -1562,7 +1562,7 @@
         <w:rPr>
           <w:rFonts w:ascii="Calibri" w:hAnsi="Calibri" w:eastAsia="Microsoft YaHei"/>
         </w:rPr>
-        <w:t>ForgeNote 将“学习画像”保存为学习记录内可查看、可编辑、可检索的特殊 Source。画像与课程资料共享 notebook 上下文，能够参与内容个性化；学生也可以直接查看证据和置信度，修正不准确的模型判断。</w:t>
+        <w:t>Forgenote 将“学习画像”保存为学习记录内可查看、可编辑、可检索的特殊 Source。画像与课程资料共享 notebook 上下文，能够参与内容个性化；学生也可以直接查看证据和置信度，修正不准确的模型判断。</w:t>
       </w:r>
     </w:p>
     <w:tbl>
@@ -2272,7 +2272,7 @@
         <w:rPr>
           <w:rFonts w:ascii="Calibri" w:hAnsi="Calibri" w:eastAsia="Microsoft YaHei"/>
         </w:rPr>
-        <w:t>脚本模型在返回逐句播客内容时，同时为概念切换点给出 visual_prompt。TTS 完成后，系统读取每句台词的真实起始时间，将视觉提示转换为带 time_index 的关键帧计划，再调用图片模型生成 16:9 画面。最后由本地 FFmpeg 按时间轴把图片和播客音频合成为 H.264/AAC MP4。视频画面与讲解内容来自同一份脚本，时间对齐可以复现，也不需要视频生成 API。</w:t>
+        <w:t>脚本模型在返回逐句播客内容时，同时为概念切换点给出 visual_prompt。TTS 完成后，系统读取每句台词的真实起始时间，将视觉提示转换为带 time_index 的关键帧计划，再调用图片模型生成 16:9 画面。最后由本地 FFmpeg 按时间轴把图片和播客音频合成为 H.264/AAC MP4。系统同时依据每段真实语音的起止时间生成 SRT，并把自动换行、分段后的中文字幕烧录到画面。视频画面、字幕与讲解内容来自同一份脚本，时间对齐可以复现，也不需要视频生成 API。</w:t>
       </w:r>
     </w:p>
     <w:p>
@@ -4132,7 +4132,7 @@
                 <w:color w:val="111827"/>
                 <w:sz w:val="17"/>
               </w:rPr>
-              <w:t>脚本视觉提示 → 真实 TTS 时间轴 → 图片 → 本地 MP4</w:t>
+              <w:t>脚本视觉提示 → 真实 TTS 时间轴 → 图片 + 字幕 → 本地 MP4</w:t>
             </w:r>
           </w:p>
         </w:tc>
@@ -4233,7 +4233,22 @@
         <w:rPr>
           <w:rFonts w:ascii="Calibri" w:hAnsi="Calibri" w:eastAsia="Microsoft YaHei"/>
         </w:rPr>
-        <w:t>FFmpeg 依据相邻 time_index 计算每张图片的持续时长，与播客音频合成为 1280×720 H.264/AAC MP4。</w:t>
+        <w:t>按每段台词的真实 start_time/end_time 生成 SRT；长台词自动换行，并在原语音时段内拆分为两行字幕。</w:t>
+      </w:r>
+    </w:p>
+    <w:p>
+      <w:pPr>
+        <w:spacing w:after="80" w:line="300" w:lineRule="auto"/>
+        <w:numPr>
+          <w:ilvl w:val="0"/>
+          <w:numId w:val="14"/>
+        </w:numPr>
+      </w:pPr>
+      <w:r>
+        <w:rPr>
+          <w:rFonts w:ascii="Calibri" w:hAnsi="Calibri" w:eastAsia="Microsoft YaHei"/>
+        </w:rPr>
+        <w:t>FFmpeg 依据相邻 time_index 计算每张图片的持续时长，将图片、播客音频和中文字幕合成为 1280×720 H.264/AAC MP4。</w:t>
       </w:r>
     </w:p>
     <w:p>
@@ -4394,7 +4409,7 @@
         <w:rPr>
           <w:rFonts w:ascii="Calibri" w:hAnsi="Calibri" w:eastAsia="Microsoft YaHei"/>
         </w:rPr>
-        <w:t>讲解视频关键帧间隔、重复提示和总帧数均受约束；合成过程只使用真实 TTS 时间戳。</w:t>
+        <w:t>讲解视频关键帧、字幕起止时间和字幕分段均来自真实 TTS 时间轴；字幕最多显示两行并直接烧录到成片。</w:t>
       </w:r>
     </w:p>
     <w:p>
@@ -6547,7 +6562,7 @@
                 <w:color w:val="111827"/>
                 <w:sz w:val="17"/>
               </w:rPr>
-              <w:t>依据真实 TTS 时间轴合成讲解视频；不调用视频生成服务</w:t>
+              <w:t>依据真实 TTS 时间轴合成画面、音频和字幕；不调用视频生成服务</w:t>
             </w:r>
           </w:p>
         </w:tc>
@@ -7983,7 +7998,7 @@
                 <w:color w:val="111827"/>
                 <w:sz w:val="17"/>
               </w:rPr>
-              <w:t>播客脚本、音频、讲解视频、关键帧计划与所属 notebook</w:t>
+              <w:t>播客脚本、音频、讲解视频、SRT 字幕、关键帧计划与所属 notebook</w:t>
             </w:r>
           </w:p>
         </w:tc>
@@ -8193,7 +8208,7 @@
                 <w:color w:val="111827"/>
                 <w:sz w:val="18"/>
               </w:rPr>
-              <w:t>桌面/开始菜单 ForgeNote；WebView2 窗口</w:t>
+              <w:t>桌面/开始菜单 Forgenote；安装文件 ForgeNote.exe；WebView2 窗口</w:t>
             </w:r>
           </w:p>
         </w:tc>
@@ -8613,7 +8628,7 @@
                 <w:color w:val="111827"/>
                 <w:sz w:val="18"/>
               </w:rPr>
-              <w:t>282 passed</w:t>
+              <w:t>285 passed</w:t>
             </w:r>
           </w:p>
         </w:tc>
@@ -8852,7 +8867,7 @@
                 <w:color w:val="111827"/>
                 <w:sz w:val="18"/>
               </w:rPr>
-              <w:t>8 passed</w:t>
+              <w:t>11 passed</w:t>
             </w:r>
           </w:p>
         </w:tc>
@@ -8878,7 +8893,7 @@
                 <w:color w:val="111827"/>
                 <w:sz w:val="18"/>
               </w:rPr>
-              <w:t>脚本提示、时间轴、图片落盘、真实 FFmpeg 合成</w:t>
+              <w:t>脚本提示、时间轴、SRT、字幕分段、图片落盘与真实 FFmpeg 合成</w:t>
             </w:r>
           </w:p>
         </w:tc>
@@ -8972,7 +8987,7 @@
         <w:rPr>
           <w:rFonts w:ascii="Calibri" w:hAnsi="Calibri" w:eastAsia="Microsoft YaHei"/>
         </w:rPr>
-        <w:t>测试结果按实际执行范围分别列出。测试说明书附有 tests/test_submission_acceptance.py、tests/test_explainer_video.py和两组 8/8 通过截图，便于在答辩现场复现。</w:t>
+        <w:t>测试结果按实际执行范围分别列出。测试说明书附有 tests/test_submission_acceptance.py、tests/test_explainer_video.py以及 8/8、11/11 两组通过截图，便于在答辩现场复现。</w:t>
       </w:r>
     </w:p>
     <w:p>
@@ -8996,7 +9011,7 @@
         <w:rPr>
           <w:rFonts w:ascii="Calibri" w:hAnsi="Calibri" w:eastAsia="Microsoft YaHei"/>
         </w:rPr>
-        <w:t>ForgeNote 基于 Open Notebook（https://github.com/lfnovo/open-notebook）二次开发，仓库保留 MIT License 与原版权声明。团队自主开发集中在学习画像、多智能体学习编排、资源搜索与确认、多类型资产、路径与评估、安全角色、模型用途化配置、任务可观测、错题本、学习曲线、Windows 交付和比赛材料。</w:t>
+        <w:t>Forgenote 基于 Open Notebook（https://github.com/lfnovo/open-notebook）二次开发，仓库保留 MIT License 与原版权声明。团队自主开发集中在学习画像、多智能体学习编排、资源搜索与确认、多类型资产、路径与评估、安全角色、模型用途化配置、任务可观测、错题本、学习曲线、Windows 交付和比赛材料。</w:t>
       </w:r>
     </w:p>
     <w:p>
@@ -9651,7 +9666,7 @@
         <w:rPr>
           <w:rFonts w:ascii="Calibri" w:hAnsi="Calibri" w:eastAsia="Microsoft YaHei"/>
         </w:rPr>
-        <w:t>讲解视频采用关键静帧与语音合成，适合知识讲解；当前版本不生成连续角色动作、复杂动画或口型同步。</w:t>
+        <w:t>讲解视频采用关键静帧、语音合成和中文字幕，适合知识讲解；当前版本不生成连续角色动作、复杂动画或口型同步。</w:t>
       </w:r>
     </w:p>
     <w:p>
@@ -10305,7 +10320,7 @@
         <w:color w:val="52647A"/>
         <w:sz w:val="18"/>
       </w:rPr>
-      <w:t xml:space="preserve">ForgeNote · </w:t>
+      <w:t xml:space="preserve">Forgenote · </w:t>
     </w:r>
     <w:r>
       <w:rPr>
@@ -10338,7 +10353,7 @@
         <w:color w:val="52647A"/>
         <w:sz w:val="17"/>
       </w:rPr>
-      <w:t>FORGENOTE · A3 SYSTEM DEVELOPMENT MANUAL</w:t>
+      <w:t>Forgenote · A3 SYSTEM DEVELOPMENT MANUAL</w:t>
     </w:r>
   </w:p>
 </w:hdr>

</xml_diff>